<commit_message>
Fix Gao 2022 -> Zhu 2022 citation in supplementary
</commit_message>
<xml_diff>
--- a/manuscript/supplementary.docx
+++ b/manuscript/supplementary.docx
@@ -168,7 +168,7 @@
               <w:pStyle w:val="Compact"/>
             </w:pPr>
             <w:r>
-              <w:t xml:space="preserve">Gao 2022</w:t>
+              <w:t xml:space="preserve">Zhu 2022</w:t>
             </w:r>
           </w:p>
         </w:tc>
@@ -414,7 +414,7 @@
               <w:pStyle w:val="Compact"/>
             </w:pPr>
             <w:r>
-              <w:t xml:space="preserve">Gao 2022</w:t>
+              <w:t xml:space="preserve">Zhu 2022</w:t>
             </w:r>
           </w:p>
         </w:tc>
@@ -708,7 +708,7 @@
               <w:pStyle w:val="Compact"/>
             </w:pPr>
             <w:r>
-              <w:t xml:space="preserve">Gao 2022</w:t>
+              <w:t xml:space="preserve">Zhu 2022</w:t>
             </w:r>
           </w:p>
         </w:tc>
@@ -954,7 +954,7 @@
               <w:pStyle w:val="Compact"/>
             </w:pPr>
             <w:r>
-              <w:t xml:space="preserve">Gao 2022</w:t>
+              <w:t xml:space="preserve">Zhu 2022</w:t>
             </w:r>
           </w:p>
         </w:tc>
@@ -1147,7 +1147,7 @@
         <w:pStyle w:val="BodyText"/>
       </w:pPr>
       <w:r>
-        <w:t xml:space="preserve">Notable observations: The highest pairwise logistic regression AUC is Ling 2020 → Gao 2022 (AUC=0.88), reflecting transfer between two large Chinese fecal cohorts. Kazakhstan → Ling 2020 also transfers reasonably (logistic regression AUC=0.74). Most pairwise AUCs cluster between 0.54 and 0.70, consistent with the overall pattern of limited cross-cohort transferability documented in Section 3.3.</w:t>
+        <w:t xml:space="preserve">Notable observations: The highest pairwise logistic regression AUC is Ling 2020 → Zhu 2022 (AUC=0.88), reflecting transfer between two large Chinese fecal cohorts. Kazakhstan → Ling 2020 also transfers reasonably (logistic regression AUC=0.74). Most pairwise AUCs cluster between 0.54 and 0.70, consistent with the overall pattern of limited cross-cohort transferability documented in Section 3.3.</w:t>
       </w:r>
     </w:p>
     <w:p>
@@ -1759,7 +1759,7 @@
               <w:pStyle w:val="Compact"/>
             </w:pPr>
             <w:r>
-              <w:t xml:space="preserve">Gao 2022</w:t>
+              <w:t xml:space="preserve">Zhu 2022</w:t>
             </w:r>
           </w:p>
         </w:tc>
@@ -2484,7 +2484,7 @@
         <w:pStyle w:val="BodyText"/>
       </w:pPr>
       <w:r>
-        <w:t xml:space="preserve">Notes: (1) Reads input = reads passing initial quality cutoff prior to DADA2 filtering. (2) Retention rates for Ling 2020 (47.9%) and Kim 2022 (45.3%) are lower than typical for MiSeq 2×300 V3–V4 data; inspection of quality profiles showed elevated error rates in these cohorts’ reverse reads at positions &gt;150–180 bp, which may reflect sequencing run-specific quality variation. (3) Kazakhstan single-end processing used truncLen=250 after quality profile inspection; see Supplementary Note S2. (4) ASV count per cohort and per-sample read depth statistics not shown here; final post-harmonization genus matrix contains 396 genera across 509 fecal samples (90 blood microbiome samples from Gao 2022 excluded prior to analysis).</w:t>
+        <w:t xml:space="preserve">Notes: (1) Reads input = reads passing initial quality cutoff prior to DADA2 filtering. (2) Retention rates for Ling 2020 (47.9%) and Kim 2022 (45.3%) are lower than typical for MiSeq 2×300 V3–V4 data; inspection of quality profiles showed elevated error rates in these cohorts’ reverse reads at positions &gt;150–180 bp, which may reflect sequencing run-specific quality variation. (3) Kazakhstan single-end processing used truncLen=250 after quality profile inspection; see Supplementary Note S2. (4) ASV count per cohort and per-sample read depth statistics not shown here; final post-harmonization genus matrix contains 396 genera across 509 fecal samples (90 blood microbiome samples from Zhu 2022 excluded prior to analysis).</w:t>
       </w:r>
     </w:p>
     <w:p>
@@ -4132,7 +4132,7 @@
               <w:pStyle w:val="Compact"/>
             </w:pPr>
             <w:r>
-              <w:t xml:space="preserve">Gao 2022</w:t>
+              <w:t xml:space="preserve">Zhu 2022</w:t>
             </w:r>
           </w:p>
         </w:tc>
@@ -4365,7 +4365,7 @@
         <w:pStyle w:val="BodyText"/>
       </w:pPr>
       <w:r>
-        <w:t xml:space="preserve">Gao 2022 analysis restricted to fecal samples only (n=60 binary: 30 AD + 30 CN). Blood microbiome samples excluded prior to all analyses. Zhuang 2018 (p=0.066) and Kazakhstan (p=0.069) did not reach α=0.05 significance for within-cohort diagnosis effect.</w:t>
+        <w:t xml:space="preserve">Zhu 2022 analysis restricted to fecal samples only (n=60 binary: 30 AD + 30 CN). Blood microbiome samples excluded prior to all analyses. Zhuang 2018 (p=0.066) and Kazakhstan (p=0.069) did not reach α=0.05 significance for within-cohort diagnosis effect.</w:t>
       </w:r>
     </w:p>
     <w:p>
@@ -4665,13 +4665,13 @@
         <w:t xml:space="preserve">Supplementary Figures</w:t>
       </w:r>
     </w:p>
-    <w:bookmarkStart w:id="13" w:name="Xa61df768ff9e69392b59ad7fd261c7690ad0a3a"/>
+    <w:bookmarkStart w:id="13" w:name="Xa8f402e2b6d4b37ecfbe0e3fe1af4eed207c1c5"/>
     <w:p>
       <w:pPr>
         <w:pStyle w:val="Heading3"/>
       </w:pPr>
       <w:r>
-        <w:t xml:space="preserve">Figure S1. Gao 2022: Fecal-Only Within-Cohort AUC</w:t>
+        <w:t xml:space="preserve">Figure S1. Zhu 2022: Fecal-Only Within-Cohort AUC</w:t>
       </w:r>
     </w:p>
     <w:p>
@@ -4689,7 +4689,7 @@
         <w:t xml:space="preserve"> </w:t>
       </w:r>
       <w:r>
-        <w:t xml:space="preserve">Within-cohort AUC-ROC for Gao 2022 fecal samples only (n=60 binary: 30 AD + 30 CN), estimated using standard StratifiedKFold 10-fold nested cross-validation. Blood microbiome (B_*) samples were excluded from all analyses; each participant appears exactly once in the fecal-only dataset, making standard StratifiedKFold appropriate. Logistic regression achieves AUC=0.998 [0.99–1.00] and LightGBM achieves AUC=0.979 [0.95–1.00]. The near-perfect within-cohort AUC should be interpreted cautiously given the small sample size (30 per class); see Section 3.2 and Section 4.3 for discussion. Error bars = 95% bootstrap CI (1,000 resamples).</w:t>
+        <w:t xml:space="preserve">Within-cohort AUC-ROC for Zhu 2022 fecal samples only (n=60 binary: 30 AD + 30 CN), estimated using standard StratifiedKFold 10-fold nested cross-validation. Blood microbiome (B_*) samples were excluded from all analyses; each participant appears exactly once in the fecal-only dataset, making standard StratifiedKFold appropriate. Logistic regression achieves AUC=0.998 [0.99–1.00] and LightGBM achieves AUC=0.979 [0.95–1.00]. The near-perfect within-cohort AUC should be interpreted cautiously given the small sample size (30 per class); see Section 3.2 and Section 4.3 for discussion. Error bars = 95% bootstrap CI (1,000 resamples).</w:t>
       </w:r>
     </w:p>
     <w:p>
@@ -4742,7 +4742,7 @@
         <w:t xml:space="preserve"> </w:t>
       </w:r>
       <w:r>
-        <w:t xml:space="preserve">SHAP feature importance dot plot for LightGBM classifiers, parallel to Figure 6A (logistic regression). Dot size proportional to mean |SHAP| value (feature importance); red = AD-associated (higher mean SHAP in AD samples); blue = CN-associated. Yellow background marks directional flip taxa appearing in top-20 of ≥2 cohorts with opposite sign (★ prefix). Top taxon per cohort: Oscillibacter (Zhuang 2018, CN-associated, |SHAP|=1.025), Akkermansia (Ling 2020, AD-associated, |SHAP|=0.828), Streptococcus (Gao 2022, AD-associated, |SHAP|=1.287), Castellaniella (Kazakhstan, CN-associated, |SHAP|=0.830). Mean pairwise Jaccard similarity at top-20: 0.026 — lower than logistic regression (0.101), consistent with tree models finding more cohort-specific features. LightGBM directional flips (top-20): Incertae Sedis, Lactobacillus, Oscillibacter.</w:t>
+        <w:t xml:space="preserve">SHAP feature importance dot plot for LightGBM classifiers, parallel to Figure 6A (logistic regression). Dot size proportional to mean |SHAP| value (feature importance); red = AD-associated (higher mean SHAP in AD samples); blue = CN-associated. Yellow background marks directional flip taxa appearing in top-20 of ≥2 cohorts with opposite sign (★ prefix). Top taxon per cohort: Oscillibacter (Zhuang 2018, CN-associated, |SHAP|=1.025), Akkermansia (Ling 2020, AD-associated, |SHAP|=0.828), Streptococcus (Zhu 2022, AD-associated, |SHAP|=1.287), Castellaniella (Kazakhstan, CN-associated, |SHAP|=0.830). Mean pairwise Jaccard similarity at top-20: 0.026 — lower than logistic regression (0.101), consistent with tree models finding more cohort-specific features. LightGBM directional flips (top-20): Incertae Sedis, Lactobacillus, Oscillibacter.</w:t>
       </w:r>
     </w:p>
     <w:p>
@@ -4824,7 +4824,7 @@
         <w:t xml:space="preserve"> </w:t>
       </w:r>
       <w:r>
-        <w:t xml:space="preserve">- Held-out Gao 2022: Faecalibacterium (LogReg), Akkermansia (LGBM)</w:t>
+        <w:t xml:space="preserve">- Held-out Zhu 2022: Faecalibacterium (LogReg), Akkermansia (LGBM)</w:t>
       </w:r>
       <w:r>
         <w:t xml:space="preserve"> </w:t>
@@ -5249,7 +5249,7 @@
         <w:t xml:space="preserve"> </w:t>
       </w:r>
       <w:r>
-        <w:t xml:space="preserve">kbase2022 was included only in PERMANOVA variance decomposition (Phase 4), where cohort identity — not per-sample diagnosis — is the grouping variable of interest. All supervised classifier training, evaluation, batch correction, and SHAP analyses were restricted to the four labeled cohorts (Zhuang 2018, Ling 2020, Gao 2022, Kazakhstan).</w:t>
+        <w:t xml:space="preserve">kbase2022 was included only in PERMANOVA variance decomposition (Phase 4), where cohort identity — not per-sample diagnosis — is the grouping variable of interest. All supervised classifier training, evaluation, batch correction, and SHAP analyses were restricted to the four labeled cohorts (Zhuang 2018, Ling 2020, Zhu 2022, Kazakhstan).</w:t>
       </w:r>
     </w:p>
     <w:p>

</xml_diff>